<commit_message>
Redraw Week 5 pipeline figure as a two-row flow without text overlap
Co-Authored-By: Claude Opus 5.5 <noreply@anthropic.com>
Claude-Session: https://claude.ai/code/session_01LE4ADpWg5vsUjrChgoCfhr
</commit_message>
<xml_diff>
--- a/MIS5308_Week5_PBL/Week5_PBL_Report_Draft.docx
+++ b/MIS5308_Week5_PBL/Week5_PBL_Report_Draft.docx
@@ -3484,7 +3484,7 @@
       <w:r>
         <w:drawing>
           <wp:inline distT="0" distB="0" distL="0" distR="0">
-            <wp:extent cx="5715000" cy="1400175"/>
+            <wp:extent cx="5334000" cy="3028950"/>
             <wp:effectExtent t="0" r="0" b="0" l="0"/>
             <wp:docPr id="1" name="" descr="" title=""/>
             <wp:cNvGraphicFramePr>
@@ -3509,7 +3509,7 @@
                   <pic:spPr bwMode="auto">
                     <a:xfrm>
                       <a:off x="0" y="0"/>
-                      <a:ext cx="5715000" cy="1400175"/>
+                      <a:ext cx="5334000" cy="3028950"/>
                     </a:xfrm>
                     <a:prstGeom prst="rect">
                       <a:avLst/>

</xml_diff>